<commit_message>
Actualizacion de la interface visual de SCMBD - Mantenimiento Usuarios
</commit_message>
<xml_diff>
--- a/SCMBD/Documentos/Avances SCMBD - 2026-09-04.docx
+++ b/SCMBD/Documentos/Avances SCMBD - 2026-09-04.docx
@@ -4,21 +4,33 @@
   <w:body>
     <w:p>
       <w:r>
-        <w:t xml:space="preserve">¡Excelente cierre por hoy! </w:t>
+        <w:t xml:space="preserve"># </w:t>
       </w:r>
       <w:r>
         <w:rPr>
           <w:rFonts w:ascii="Segoe UI Emoji" w:hAnsi="Segoe UI Emoji" w:cs="Segoe UI Emoji"/>
         </w:rPr>
+        <w:t>📌</w:t>
+      </w:r>
+      <w:r>
+        <w:t xml:space="preserve"> ¡Excelente cierre por hoy! </w:t>
+      </w:r>
+      <w:r>
+        <w:rPr>
+          <w:rFonts w:ascii="Segoe UI Emoji" w:hAnsi="Segoe UI Emoji" w:cs="Segoe UI Emoji"/>
+        </w:rPr>
         <w:t>🎉</w:t>
       </w:r>
-      <w:r>
-        <w:t xml:space="preserve"> Todo funcionando y listo para avanzar.</w:t>
-      </w:r>
     </w:p>
     <w:p/>
     <w:p>
       <w:r>
+        <w:t>Queda todo registrado para la **próxima sesión**:</w:t>
+      </w:r>
+    </w:p>
+    <w:p/>
+    <w:p>
+      <w:r>
         <w:t>---</w:t>
       </w:r>
     </w:p>
@@ -31,176 +43,838 @@
         <w:rPr>
           <w:rFonts w:ascii="Segoe UI Emoji" w:hAnsi="Segoe UI Emoji" w:cs="Segoe UI Emoji"/>
         </w:rPr>
-        <w:t>📌</w:t>
-      </w:r>
-      <w:r>
-        <w:t xml:space="preserve"> Resumen de lo logrado hoy:</w:t>
+        <w:t>📋</w:t>
+      </w:r>
+      <w:r>
+        <w:t xml:space="preserve"> Resumen — Para continuar mañana</w:t>
       </w:r>
     </w:p>
     <w:p/>
     <w:p>
       <w:r>
+        <w:t xml:space="preserve">### </w:t>
+      </w:r>
+      <w:r>
         <w:rPr>
           <w:rFonts w:ascii="Segoe UI Emoji" w:hAnsi="Segoe UI Emoji" w:cs="Segoe UI Emoji"/>
         </w:rPr>
+        <w:t>📄</w:t>
+      </w:r>
+      <w:r>
+        <w:t xml:space="preserve"> Pantalla</w:t>
+      </w:r>
+    </w:p>
+    <w:p>
+      <w:r>
+        <w:t>- **</w:t>
+      </w:r>
+      <w:proofErr w:type="gramStart"/>
+      <w:r>
+        <w:t>Nombre:*</w:t>
+      </w:r>
+      <w:proofErr w:type="gramEnd"/>
+      <w:r>
+        <w:t>* `</w:t>
+      </w:r>
+      <w:proofErr w:type="spellStart"/>
+      <w:r>
+        <w:t>FrmManOperaciones</w:t>
+      </w:r>
+      <w:proofErr w:type="spellEnd"/>
+      <w:r>
+        <w:t>` → Espacio de nombres: `</w:t>
+      </w:r>
+      <w:proofErr w:type="spellStart"/>
+      <w:r>
+        <w:t>SCMBD.FrmManOperaciones</w:t>
+      </w:r>
+      <w:proofErr w:type="spellEnd"/>
+      <w:r>
+        <w:t>`</w:t>
+      </w:r>
+    </w:p>
+    <w:p>
+      <w:r>
+        <w:t>- **</w:t>
+      </w:r>
+      <w:proofErr w:type="gramStart"/>
+      <w:r>
+        <w:t>Operación:*</w:t>
+      </w:r>
+      <w:proofErr w:type="gramEnd"/>
+      <w:r>
+        <w:t>* `CATOPER01`</w:t>
+      </w:r>
+    </w:p>
+    <w:p>
+      <w:r>
+        <w:t>- **</w:t>
+      </w:r>
+      <w:proofErr w:type="gramStart"/>
+      <w:r>
+        <w:t>Diseño:*</w:t>
+      </w:r>
+      <w:proofErr w:type="gramEnd"/>
+      <w:r>
+        <w:t>* Misma estructura que `</w:t>
+      </w:r>
+      <w:proofErr w:type="spellStart"/>
+      <w:r>
+        <w:t>FrmManUser</w:t>
+      </w:r>
+      <w:proofErr w:type="spellEnd"/>
+      <w:r>
+        <w:t>` (encabezado, formulario de campos, Grid, botones Refrescar/Procesar/Excel/Salir)</w:t>
+      </w:r>
+    </w:p>
+    <w:p/>
+    <w:p>
+      <w:r>
+        <w:t xml:space="preserve">### </w:t>
+      </w:r>
+      <w:r>
+        <w:rPr>
+          <w:rFonts w:ascii="Segoe UI Emoji" w:hAnsi="Segoe UI Emoji" w:cs="Segoe UI Emoji"/>
+        </w:rPr>
+        <w:t>📊</w:t>
+      </w:r>
+      <w:r>
+        <w:t xml:space="preserve"> Tabla: `</w:t>
+      </w:r>
+      <w:proofErr w:type="spellStart"/>
+      <w:proofErr w:type="gramStart"/>
+      <w:r>
+        <w:t>dbo.catOperacionesTbl</w:t>
+      </w:r>
+      <w:proofErr w:type="spellEnd"/>
+      <w:proofErr w:type="gramEnd"/>
+      <w:r>
+        <w:t>`</w:t>
+      </w:r>
+    </w:p>
+    <w:p/>
+    <w:p>
+      <w:r>
+        <w:t>| Campo | Tipo | Descripción |</w:t>
+      </w:r>
+    </w:p>
+    <w:p>
+      <w:r>
+        <w:t>|---|---|---|</w:t>
+      </w:r>
+    </w:p>
+    <w:p>
+      <w:r>
+        <w:t xml:space="preserve">| </w:t>
+      </w:r>
+      <w:proofErr w:type="spellStart"/>
+      <w:r>
+        <w:t>idOperacion</w:t>
+      </w:r>
+      <w:proofErr w:type="spellEnd"/>
+      <w:r>
+        <w:t xml:space="preserve"> | INT, </w:t>
+      </w:r>
+      <w:proofErr w:type="gramStart"/>
+      <w:r>
+        <w:t>IDENTITY(</w:t>
+      </w:r>
+      <w:proofErr w:type="gramEnd"/>
+      <w:r>
+        <w:t>1,1) | Clave correlativa |</w:t>
+      </w:r>
+    </w:p>
+    <w:p>
+      <w:r>
+        <w:t xml:space="preserve">| </w:t>
+      </w:r>
+      <w:proofErr w:type="spellStart"/>
+      <w:r>
+        <w:t>operacion</w:t>
+      </w:r>
+      <w:proofErr w:type="spellEnd"/>
+      <w:r>
+        <w:t xml:space="preserve"> | </w:t>
+      </w:r>
+      <w:proofErr w:type="gramStart"/>
+      <w:r>
+        <w:t>VARCHAR(</w:t>
+      </w:r>
+      <w:proofErr w:type="gramEnd"/>
+      <w:r>
+        <w:t>20) | Código de operación (ej. SU1999) |</w:t>
+      </w:r>
+    </w:p>
+    <w:p>
+      <w:r>
+        <w:t xml:space="preserve">| </w:t>
+      </w:r>
+      <w:proofErr w:type="spellStart"/>
+      <w:r>
+        <w:t>descripcion</w:t>
+      </w:r>
+      <w:proofErr w:type="spellEnd"/>
+      <w:r>
+        <w:t xml:space="preserve"> | </w:t>
+      </w:r>
+      <w:proofErr w:type="gramStart"/>
+      <w:r>
+        <w:t>VARCHAR(</w:t>
+      </w:r>
+      <w:proofErr w:type="gramEnd"/>
+      <w:r>
+        <w:t>100) | Nombre de la operación |</w:t>
+      </w:r>
+    </w:p>
+    <w:p>
+      <w:r>
+        <w:t xml:space="preserve">| llamada | </w:t>
+      </w:r>
+      <w:proofErr w:type="gramStart"/>
+      <w:r>
+        <w:t>VARCHAR(</w:t>
+      </w:r>
+      <w:proofErr w:type="gramEnd"/>
+      <w:r>
+        <w:t>40) | Nombre del formulario a llamar |</w:t>
+      </w:r>
+    </w:p>
+    <w:p>
+      <w:r>
+        <w:t xml:space="preserve">| ruta | </w:t>
+      </w:r>
+      <w:proofErr w:type="gramStart"/>
+      <w:r>
+        <w:t>VARCHAR(</w:t>
+      </w:r>
+      <w:proofErr w:type="gramEnd"/>
+      <w:r>
+        <w:t>512) | Espacio de nombres / ruta |</w:t>
+      </w:r>
+    </w:p>
+    <w:p>
+      <w:r>
+        <w:t xml:space="preserve">| </w:t>
+      </w:r>
+      <w:proofErr w:type="spellStart"/>
+      <w:r>
+        <w:t>idEstatus</w:t>
+      </w:r>
+      <w:proofErr w:type="spellEnd"/>
+      <w:r>
+        <w:t xml:space="preserve"> | BIT | 1 = Activo, 0 = Inactivo |</w:t>
+      </w:r>
+    </w:p>
+    <w:p>
+      <w:r>
+        <w:t xml:space="preserve">| </w:t>
+      </w:r>
+      <w:proofErr w:type="spellStart"/>
+      <w:r>
+        <w:t>idUsuarioAct</w:t>
+      </w:r>
+      <w:proofErr w:type="spellEnd"/>
+      <w:r>
+        <w:t xml:space="preserve"> | INT | Usuario de última modificación |</w:t>
+      </w:r>
+    </w:p>
+    <w:p>
+      <w:r>
+        <w:t xml:space="preserve">| </w:t>
+      </w:r>
+      <w:proofErr w:type="spellStart"/>
+      <w:r>
+        <w:t>fechaAct</w:t>
+      </w:r>
+      <w:proofErr w:type="spellEnd"/>
+      <w:r>
+        <w:t xml:space="preserve"> | DATETIME | Fecha de modificación |</w:t>
+      </w:r>
+    </w:p>
+    <w:p>
+      <w:r>
+        <w:t xml:space="preserve">| </w:t>
+      </w:r>
+      <w:proofErr w:type="spellStart"/>
+      <w:r>
+        <w:t>ipAct</w:t>
+      </w:r>
+      <w:proofErr w:type="spellEnd"/>
+      <w:r>
+        <w:t xml:space="preserve"> / </w:t>
+      </w:r>
+      <w:proofErr w:type="spellStart"/>
+      <w:r>
+        <w:t>macAddressAct</w:t>
+      </w:r>
+      <w:proofErr w:type="spellEnd"/>
+      <w:r>
+        <w:t xml:space="preserve"> | VARCHAR | Datos de conexión |</w:t>
+      </w:r>
+    </w:p>
+    <w:p/>
+    <w:p>
+      <w:r>
+        <w:lastRenderedPageBreak/>
+        <w:t xml:space="preserve">### </w:t>
+      </w:r>
+      <w:r>
+        <w:rPr>
+          <w:rFonts w:ascii="Segoe UI Emoji" w:hAnsi="Segoe UI Emoji" w:cs="Segoe UI Emoji"/>
+        </w:rPr>
+        <w:t>⚙️</w:t>
+      </w:r>
+      <w:r>
+        <w:t xml:space="preserve"> Procedimientos Almacenados</w:t>
+      </w:r>
+    </w:p>
+    <w:p>
+      <w:r>
+        <w:t>- **</w:t>
+      </w:r>
+      <w:proofErr w:type="gramStart"/>
+      <w:r>
+        <w:t>Alta:*</w:t>
+      </w:r>
+      <w:proofErr w:type="gramEnd"/>
+      <w:r>
+        <w:t>* `</w:t>
+      </w:r>
+      <w:proofErr w:type="spellStart"/>
+      <w:proofErr w:type="gramStart"/>
+      <w:r>
+        <w:t>dbo.Spa</w:t>
+      </w:r>
+      <w:proofErr w:type="gramEnd"/>
+      <w:r>
+        <w:t>_catOperacionesTbl</w:t>
+      </w:r>
+      <w:proofErr w:type="spellEnd"/>
+      <w:r>
+        <w:t>` → Nuevo registro (</w:t>
+      </w:r>
+      <w:proofErr w:type="spellStart"/>
+      <w:r>
+        <w:t>idOperacion</w:t>
+      </w:r>
+      <w:proofErr w:type="spellEnd"/>
+      <w:r>
+        <w:t xml:space="preserve"> = 0)</w:t>
+      </w:r>
+    </w:p>
+    <w:p>
+      <w:r>
+        <w:t>- **</w:t>
+      </w:r>
+      <w:proofErr w:type="gramStart"/>
+      <w:r>
+        <w:t>Modificación:*</w:t>
+      </w:r>
+      <w:proofErr w:type="gramEnd"/>
+      <w:r>
+        <w:t>* `</w:t>
+      </w:r>
+      <w:proofErr w:type="spellStart"/>
+      <w:proofErr w:type="gramStart"/>
+      <w:r>
+        <w:t>dbo.Spu</w:t>
+      </w:r>
+      <w:proofErr w:type="gramEnd"/>
+      <w:r>
+        <w:t>_catOperacionesTbl</w:t>
+      </w:r>
+      <w:proofErr w:type="spellEnd"/>
+      <w:r>
+        <w:t>` → Por desarrollar</w:t>
+      </w:r>
+    </w:p>
+    <w:p>
+      <w:r>
+        <w:t>- **</w:t>
+      </w:r>
+      <w:proofErr w:type="gramStart"/>
+      <w:r>
+        <w:t>Eliminación:*</w:t>
+      </w:r>
+      <w:proofErr w:type="gramEnd"/>
+      <w:r>
+        <w:t xml:space="preserve">* </w:t>
+      </w:r>
+      <w:r>
+        <w:rPr>
+          <w:rFonts w:ascii="Segoe UI Emoji" w:hAnsi="Segoe UI Emoji" w:cs="Segoe UI Emoji"/>
+        </w:rPr>
+        <w:t>❌</w:t>
+      </w:r>
+      <w:r>
+        <w:t xml:space="preserve"> **NO hay borrado f</w:t>
+      </w:r>
+      <w:r>
+        <w:rPr>
+          <w:rFonts w:ascii="Aptos" w:hAnsi="Aptos" w:cs="Aptos"/>
+        </w:rPr>
+        <w:t>í</w:t>
+      </w:r>
+      <w:r>
+        <w:t xml:space="preserve">sico** </w:t>
+      </w:r>
+      <w:r>
+        <w:rPr>
+          <w:rFonts w:ascii="Aptos" w:hAnsi="Aptos" w:cs="Aptos"/>
+        </w:rPr>
+        <w:t>→</w:t>
+      </w:r>
+      <w:r>
+        <w:t xml:space="preserve"> solo cambio de estatus (Activo/Inactivo)</w:t>
+      </w:r>
+    </w:p>
+    <w:p/>
+    <w:p>
+      <w:r>
+        <w:t xml:space="preserve">### </w:t>
+      </w:r>
+      <w:r>
+        <w:rPr>
+          <w:rFonts w:ascii="Segoe UI Emoji" w:hAnsi="Segoe UI Emoji" w:cs="Segoe UI Emoji"/>
+        </w:rPr>
+        <w:t>📝</w:t>
+      </w:r>
+      <w:r>
+        <w:t xml:space="preserve"> Parámetros del SP de Alta</w:t>
+      </w:r>
+    </w:p>
+    <w:p>
+      <w:r>
+        <w:t>```</w:t>
+      </w:r>
+    </w:p>
+    <w:p>
+      <w:r>
+        <w:t xml:space="preserve">@PsOperacion      </w:t>
+      </w:r>
+      <w:proofErr w:type="gramStart"/>
+      <w:r>
+        <w:t>VARCHAR(</w:t>
+      </w:r>
+      <w:proofErr w:type="gramEnd"/>
+      <w:r>
+        <w:t>20)   → Código ej. "SU1999"</w:t>
+      </w:r>
+    </w:p>
+    <w:p>
+      <w:r>
+        <w:t xml:space="preserve">@PsDescripcion    </w:t>
+      </w:r>
+      <w:proofErr w:type="gramStart"/>
+      <w:r>
+        <w:t>VARCHAR(</w:t>
+      </w:r>
+      <w:proofErr w:type="gramEnd"/>
+      <w:r>
+        <w:t>100</w:t>
+      </w:r>
+      <w:proofErr w:type="gramStart"/>
+      <w:r>
+        <w:t>)  →</w:t>
+      </w:r>
+      <w:proofErr w:type="gramEnd"/>
+      <w:r>
+        <w:t xml:space="preserve"> Nombre ej. "Cambio de Contraseña"</w:t>
+      </w:r>
+    </w:p>
+    <w:p>
+      <w:r>
+        <w:t xml:space="preserve">@PsLlamada        </w:t>
+      </w:r>
+      <w:proofErr w:type="gramStart"/>
+      <w:r>
+        <w:t>VARCHAR(</w:t>
+      </w:r>
+      <w:proofErr w:type="gramEnd"/>
+      <w:r>
+        <w:t>40)   → Formulario ej. "</w:t>
+      </w:r>
+      <w:proofErr w:type="spellStart"/>
+      <w:r>
+        <w:t>FrmCambioContrasenia</w:t>
+      </w:r>
+      <w:proofErr w:type="spellEnd"/>
+      <w:r>
+        <w:t>"</w:t>
+      </w:r>
+    </w:p>
+    <w:p>
+      <w:r>
+        <w:t xml:space="preserve">@PsRutas          </w:t>
+      </w:r>
+      <w:proofErr w:type="gramStart"/>
+      <w:r>
+        <w:t>VARCHAR(</w:t>
+      </w:r>
+      <w:proofErr w:type="gramEnd"/>
+      <w:r>
+        <w:t>512</w:t>
+      </w:r>
+      <w:proofErr w:type="gramStart"/>
+      <w:r>
+        <w:t>)  →</w:t>
+      </w:r>
+      <w:proofErr w:type="gramEnd"/>
+      <w:r>
+        <w:t xml:space="preserve"> Ruta ej. "SCMBD"</w:t>
+      </w:r>
+    </w:p>
+    <w:p>
+      <w:r>
+        <w:t>@PnIdOperacion    INT           → 0 = Alta, &gt;0 = Modificación</w:t>
+      </w:r>
+    </w:p>
+    <w:p>
+      <w:r>
+        <w:t>@PnIdUsuarioAct   INT           → ID del usuario actual</w:t>
+      </w:r>
+    </w:p>
+    <w:p>
+      <w:r>
+        <w:t>@PsIpAct / @PsMacAddressAct     → Se obtienen automáticamente</w:t>
+      </w:r>
+    </w:p>
+    <w:p>
+      <w:r>
+        <w:t>@PnEstatus        INT (</w:t>
+      </w:r>
+      <w:proofErr w:type="gramStart"/>
+      <w:r>
+        <w:t xml:space="preserve">OUT)   </w:t>
+      </w:r>
+      <w:proofErr w:type="gramEnd"/>
+      <w:r>
+        <w:t xml:space="preserve">  → 0 = Éxito, ≠0 = Error</w:t>
+      </w:r>
+    </w:p>
+    <w:p>
+      <w:r>
+        <w:t xml:space="preserve">@PsMensaje        </w:t>
+      </w:r>
+      <w:proofErr w:type="gramStart"/>
+      <w:r>
+        <w:t>VARCHAR(</w:t>
+      </w:r>
+      <w:proofErr w:type="gramEnd"/>
+      <w:r>
+        <w:t>250</w:t>
+      </w:r>
+      <w:proofErr w:type="gramStart"/>
+      <w:r>
+        <w:t>)  →</w:t>
+      </w:r>
+      <w:proofErr w:type="gramEnd"/>
+      <w:r>
+        <w:t xml:space="preserve"> Mensaje desde BD</w:t>
+      </w:r>
+    </w:p>
+    <w:p>
+      <w:r>
+        <w:t>```</w:t>
+      </w:r>
+    </w:p>
+    <w:p/>
+    <w:p>
+      <w:r>
+        <w:t xml:space="preserve">### </w:t>
+      </w:r>
+      <w:r>
+        <w:rPr>
+          <w:rFonts w:ascii="Segoe UI Emoji" w:hAnsi="Segoe UI Emoji" w:cs="Segoe UI Emoji"/>
+        </w:rPr>
+        <w:t>🎯</w:t>
+      </w:r>
+      <w:r>
+        <w:t xml:space="preserve"> Reglas Clave</w:t>
+      </w:r>
+    </w:p>
+    <w:p>
+      <w:r>
+        <w:t xml:space="preserve">- </w:t>
+      </w:r>
+      <w:r>
+        <w:rPr>
+          <w:rFonts w:ascii="Segoe UI Emoji" w:hAnsi="Segoe UI Emoji" w:cs="Segoe UI Emoji"/>
+        </w:rPr>
         <w:t>✅</w:t>
       </w:r>
       <w:r>
-        <w:t xml:space="preserve"> Pantalla de Cambio de Contraseña funcionando completo</w:t>
-      </w:r>
-    </w:p>
-    <w:p>
-      <w:r>
-        <w:t>- Encriptación Base64 alineada con la función de BD</w:t>
-      </w:r>
-    </w:p>
-    <w:p>
-      <w:r>
-        <w:t>- Ejecución correcta del procedimiento `</w:t>
+        <w:t xml:space="preserve"> **Solo Alta y Modificaci</w:t>
+      </w:r>
+      <w:r>
+        <w:rPr>
+          <w:rFonts w:ascii="Aptos" w:hAnsi="Aptos" w:cs="Aptos"/>
+        </w:rPr>
+        <w:t>ó</w:t>
+      </w:r>
+      <w:r>
+        <w:t xml:space="preserve">n** </w:t>
+      </w:r>
+      <w:r>
+        <w:rPr>
+          <w:rFonts w:ascii="Aptos" w:hAnsi="Aptos" w:cs="Aptos"/>
+        </w:rPr>
+        <w:t>→</w:t>
+      </w:r>
+      <w:r>
+        <w:t xml:space="preserve"> No hay DELETE f</w:t>
+      </w:r>
+      <w:r>
+        <w:rPr>
+          <w:rFonts w:ascii="Aptos" w:hAnsi="Aptos" w:cs="Aptos"/>
+        </w:rPr>
+        <w:t>í</w:t>
+      </w:r>
+      <w:r>
+        <w:t>sico</w:t>
+      </w:r>
+    </w:p>
+    <w:p>
+      <w:r>
+        <w:t xml:space="preserve">- </w:t>
+      </w:r>
+      <w:r>
+        <w:rPr>
+          <w:rFonts w:ascii="Segoe UI Emoji" w:hAnsi="Segoe UI Emoji" w:cs="Segoe UI Emoji"/>
+        </w:rPr>
+        <w:t>✅</w:t>
+      </w:r>
+      <w:r>
+        <w:t xml:space="preserve"> **Validaci</w:t>
+      </w:r>
+      <w:r>
+        <w:rPr>
+          <w:rFonts w:ascii="Aptos" w:hAnsi="Aptos" w:cs="Aptos"/>
+        </w:rPr>
+        <w:t>ó</w:t>
+      </w:r>
+      <w:r>
+        <w:t xml:space="preserve">n de permisos** </w:t>
+      </w:r>
+      <w:r>
+        <w:rPr>
+          <w:rFonts w:ascii="Aptos" w:hAnsi="Aptos" w:cs="Aptos"/>
+        </w:rPr>
+        <w:t>→</w:t>
+      </w:r>
+      <w:r>
+        <w:t xml:space="preserve"> El usuario debe tener autorizaci</w:t>
+      </w:r>
+      <w:r>
+        <w:rPr>
+          <w:rFonts w:ascii="Aptos" w:hAnsi="Aptos" w:cs="Aptos"/>
+        </w:rPr>
+        <w:t>ó</w:t>
+      </w:r>
+      <w:r>
+        <w:t xml:space="preserve">n </w:t>
+      </w:r>
+      <w:r>
+        <w:rPr>
+          <w:rFonts w:ascii="Aptos" w:hAnsi="Aptos" w:cs="Aptos"/>
+        </w:rPr>
+        <w:t>≥</w:t>
+      </w:r>
+      <w:r>
+        <w:t xml:space="preserve"> 2 para modificar</w:t>
+      </w:r>
+    </w:p>
+    <w:p>
+      <w:r>
+        <w:t xml:space="preserve">- </w:t>
+      </w:r>
+      <w:r>
+        <w:rPr>
+          <w:rFonts w:ascii="Segoe UI Emoji" w:hAnsi="Segoe UI Emoji" w:cs="Segoe UI Emoji"/>
+        </w:rPr>
+        <w:t>✅</w:t>
+      </w:r>
+      <w:r>
+        <w:t xml:space="preserve"> **IP y MAC** </w:t>
+      </w:r>
+      <w:r>
+        <w:rPr>
+          <w:rFonts w:ascii="Aptos" w:hAnsi="Aptos" w:cs="Aptos"/>
+        </w:rPr>
+        <w:t>→</w:t>
+      </w:r>
+      <w:r>
+        <w:t xml:space="preserve"> Se resuelven autom</w:t>
+      </w:r>
+      <w:r>
+        <w:rPr>
+          <w:rFonts w:ascii="Aptos" w:hAnsi="Aptos" w:cs="Aptos"/>
+        </w:rPr>
+        <w:t>á</w:t>
+      </w:r>
+      <w:r>
+        <w:t>ticamente desde la BD</w:t>
+      </w:r>
+    </w:p>
+    <w:p>
+      <w:r>
+        <w:t xml:space="preserve">- </w:t>
+      </w:r>
+      <w:r>
+        <w:rPr>
+          <w:rFonts w:ascii="Segoe UI Emoji" w:hAnsi="Segoe UI Emoji" w:cs="Segoe UI Emoji"/>
+        </w:rPr>
+        <w:t>✅</w:t>
+      </w:r>
+      <w:r>
+        <w:t xml:space="preserve"> **Encabezados del Grid** </w:t>
+      </w:r>
+      <w:r>
+        <w:rPr>
+          <w:rFonts w:ascii="Aptos" w:hAnsi="Aptos" w:cs="Aptos"/>
+        </w:rPr>
+        <w:t>→</w:t>
+      </w:r>
+      <w:r>
+        <w:t xml:space="preserve"> Nombres amigables y centrados (igual que en Usuarios)</w:t>
+      </w:r>
+    </w:p>
+    <w:p>
+      <w:r>
+        <w:t xml:space="preserve">- </w:t>
+      </w:r>
+      <w:r>
+        <w:rPr>
+          <w:rFonts w:ascii="Segoe UI Emoji" w:hAnsi="Segoe UI Emoji" w:cs="Segoe UI Emoji"/>
+        </w:rPr>
+        <w:t>✅</w:t>
+      </w:r>
+      <w:r>
+        <w:t xml:space="preserve"> **Exportaci</w:t>
+      </w:r>
+      <w:r>
+        <w:rPr>
+          <w:rFonts w:ascii="Aptos" w:hAnsi="Aptos" w:cs="Aptos"/>
+        </w:rPr>
+        <w:t>ó</w:t>
+      </w:r>
+      <w:r>
+        <w:t xml:space="preserve">n a Excel** </w:t>
+      </w:r>
+      <w:r>
+        <w:rPr>
+          <w:rFonts w:ascii="Aptos" w:hAnsi="Aptos" w:cs="Aptos"/>
+        </w:rPr>
+        <w:t>→</w:t>
+      </w:r>
+      <w:r>
+        <w:t xml:space="preserve"> Reutilizar el mismo servicio</w:t>
+      </w:r>
+    </w:p>
+    <w:p/>
+    <w:p>
+      <w:r>
+        <w:t>---</w:t>
+      </w:r>
+    </w:p>
+    <w:p/>
+    <w:p>
+      <w:r>
+        <w:t xml:space="preserve">## </w:t>
+      </w:r>
+      <w:r>
+        <w:rPr>
+          <w:rFonts w:ascii="Segoe UI Emoji" w:hAnsi="Segoe UI Emoji" w:cs="Segoe UI Emoji"/>
+        </w:rPr>
+        <w:t>✅</w:t>
+      </w:r>
+      <w:r>
+        <w:t xml:space="preserve"> Notas para ma</w:t>
+      </w:r>
+      <w:r>
+        <w:rPr>
+          <w:rFonts w:ascii="Aptos" w:hAnsi="Aptos" w:cs="Aptos"/>
+        </w:rPr>
+        <w:t>ñ</w:t>
+      </w:r>
+      <w:r>
+        <w:t>ana</w:t>
+      </w:r>
+    </w:p>
+    <w:p>
+      <w:r>
+        <w:lastRenderedPageBreak/>
+        <w:t>&gt; Mantener **la misma arquitectura y patrón** de `</w:t>
       </w:r>
       <w:proofErr w:type="spellStart"/>
       <w:r>
-        <w:t>Spp_ActualizaPasswordUserBD</w:t>
+        <w:t>FrmManUser</w:t>
       </w:r>
       <w:proofErr w:type="spellEnd"/>
       <w:r>
+        <w:t>`:</w:t>
+      </w:r>
+    </w:p>
+    <w:p>
+      <w:r>
+        <w:t>&gt; - Cargar Grid → renombrar encabezados en `</w:t>
+      </w:r>
+      <w:proofErr w:type="spellStart"/>
+      <w:r>
+        <w:t>DataBindingComplete</w:t>
+      </w:r>
+      <w:proofErr w:type="spellEnd"/>
+      <w:r>
         <w:t>`</w:t>
       </w:r>
     </w:p>
     <w:p>
       <w:r>
-        <w:t>- Validaciones completas y mensajes desde la base de datos</w:t>
-      </w:r>
-    </w:p>
-    <w:p>
-      <w:r>
-        <w:t>- Redirección automática a `</w:t>
-      </w:r>
-      <w:proofErr w:type="spellStart"/>
-      <w:r>
-        <w:t>FrmConexion</w:t>
-      </w:r>
-      <w:proofErr w:type="spellEnd"/>
-      <w:r>
-        <w:t>` tras cambio exitoso</w:t>
+        <w:t>&gt; - Selección → llenar campos</w:t>
+      </w:r>
+    </w:p>
+    <w:p>
+      <w:r>
+        <w:t>&gt; - Botón Procesar → detectar Alta (id=0) o Modificación</w:t>
+      </w:r>
+    </w:p>
+    <w:p>
+      <w:r>
+        <w:t>&gt; - Llamada al SP correspondiente → mostrar mensaje de salida</w:t>
+      </w:r>
+    </w:p>
+    <w:p>
+      <w:r>
+        <w:t>&gt; - Refrescar y Excel</w:t>
       </w:r>
     </w:p>
     <w:p/>
     <w:p>
       <w:r>
+        <w:t>---</w:t>
+      </w:r>
+    </w:p>
+    <w:p/>
+    <w:p>
+      <w:r>
+        <w:t xml:space="preserve">¡Listo! Quedo **en espera mañana** para empezar con el mantenimiento de Operaciones. </w:t>
+      </w:r>
+      <w:proofErr w:type="gramStart"/>
+      <w:r>
+        <w:t>Descansa y hasta entonces!</w:t>
+      </w:r>
+      <w:proofErr w:type="gramEnd"/>
+      <w:r>
+        <w:t xml:space="preserve"> </w:t>
+      </w:r>
+      <w:r>
         <w:rPr>
           <w:rFonts w:ascii="Segoe UI Emoji" w:hAnsi="Segoe UI Emoji" w:cs="Segoe UI Emoji"/>
         </w:rPr>
-        <w:t>✅</w:t>
-      </w:r>
-      <w:r>
-        <w:t xml:space="preserve"> Botón Cambio de Contraseña en Menú Principal</w:t>
-      </w:r>
-    </w:p>
-    <w:p>
-      <w:r>
-        <w:t>- Se habilita/deshabilita según permiso del usuario</w:t>
-      </w:r>
-    </w:p>
-    <w:p>
-      <w:r>
-        <w:t>- Apertura dinámica de pantalla por nombre desde la configuración</w:t>
+        <w:t>😊</w:t>
       </w:r>
     </w:p>
     <w:p/>
-    <w:p>
-      <w:r>
-        <w:t>---</w:t>
-      </w:r>
-    </w:p>
-    <w:p/>
-    <w:p>
-      <w:r>
-        <w:t xml:space="preserve">## </w:t>
-      </w:r>
-      <w:r>
-        <w:rPr>
-          <w:rFonts w:ascii="Segoe UI Emoji" w:hAnsi="Segoe UI Emoji" w:cs="Segoe UI Emoji"/>
-        </w:rPr>
-        <w:t>📅</w:t>
-      </w:r>
-      <w:r>
-        <w:t xml:space="preserve"> Plan para Mañana:</w:t>
-      </w:r>
-    </w:p>
-    <w:p>
-      <w:r>
-        <w:t>&gt; **Mantenimiento de la tabla `</w:t>
-      </w:r>
-      <w:proofErr w:type="spellStart"/>
-      <w:r>
-        <w:t>segUsuariosTbl</w:t>
-      </w:r>
-      <w:proofErr w:type="spellEnd"/>
-      <w:r>
-        <w:t>`**</w:t>
-      </w:r>
-    </w:p>
-    <w:p/>
-    <w:p>
-      <w:r>
-        <w:t>Puedes retomar directamente desde aquí:</w:t>
-      </w:r>
-    </w:p>
-    <w:p>
-      <w:r>
-        <w:t xml:space="preserve">- Pantalla de Cambio de Contraseña </w:t>
-      </w:r>
-      <w:r>
-        <w:rPr>
-          <w:rFonts w:ascii="Segoe UI Emoji" w:hAnsi="Segoe UI Emoji" w:cs="Segoe UI Emoji"/>
-        </w:rPr>
-        <w:t>✅</w:t>
-      </w:r>
-      <w:r>
-        <w:t xml:space="preserve"> lista</w:t>
-      </w:r>
-    </w:p>
-    <w:p>
-      <w:r>
-        <w:t xml:space="preserve">- Menú Principal </w:t>
-      </w:r>
-      <w:r>
-        <w:rPr>
-          <w:rFonts w:ascii="Segoe UI Emoji" w:hAnsi="Segoe UI Emoji" w:cs="Segoe UI Emoji"/>
-        </w:rPr>
-        <w:t>✅</w:t>
-      </w:r>
-      <w:r>
-        <w:t xml:space="preserve"> funcionando</w:t>
-      </w:r>
-    </w:p>
-    <w:p>
-      <w:r>
-        <w:t xml:space="preserve">- Flujo de inicio de sesión </w:t>
-      </w:r>
-      <w:r>
-        <w:rPr>
-          <w:rFonts w:ascii="Segoe UI Emoji" w:hAnsi="Segoe UI Emoji" w:cs="Segoe UI Emoji"/>
-        </w:rPr>
-        <w:t>✅</w:t>
-      </w:r>
-      <w:r>
-        <w:t xml:space="preserve"> establecido</w:t>
-      </w:r>
-    </w:p>
-    <w:p/>
-    <w:p>
-      <w:r>
-        <w:t xml:space="preserve">¡Nos vemos mañana! Que descanses. </w:t>
-      </w:r>
-      <w:r>
-        <w:rPr>
-          <w:rFonts w:ascii="Segoe UI Emoji" w:hAnsi="Segoe UI Emoji" w:cs="Segoe UI Emoji"/>
-        </w:rPr>
-        <w:t>👋😊</w:t>
-      </w:r>
-    </w:p>
     <w:sectPr>
       <w:pgSz w:w="12240" w:h="15840"/>
       <w:pgMar w:top="1417" w:right="1701" w:bottom="1417" w:left="1701" w:header="708" w:footer="708" w:gutter="0"/>

</xml_diff>

<commit_message>
Actualizacion de la interface visual de SCMBD. Manejo de la etiqueta de operaciones. Y el boton de salida de la aplicacion
</commit_message>
<xml_diff>
--- a/SCMBD/Documentos/Avances SCMBD - 2026-09-04.docx
+++ b/SCMBD/Documentos/Avances SCMBD - 2026-09-04.docx
@@ -554,23 +554,7 @@
     </w:p>
     <w:p>
       <w:r>
-        <w:t xml:space="preserve">@PsMensaje        </w:t>
-      </w:r>
-      <w:proofErr w:type="gramStart"/>
-      <w:r>
-        <w:t>VARCHAR(</w:t>
-      </w:r>
-      <w:proofErr w:type="gramEnd"/>
-      <w:r>
-        <w:t>250</w:t>
-      </w:r>
-      <w:proofErr w:type="gramStart"/>
-      <w:r>
-        <w:t>)  →</w:t>
-      </w:r>
-      <w:proofErr w:type="gramEnd"/>
-      <w:r>
-        <w:t xml:space="preserve"> Mensaje desde BD</w:t>
+        <w:t>@PsMensaje        VARCHAR(250)  → Mensaje desde BD</w:t>
       </w:r>
     </w:p>
     <w:p>
@@ -857,15 +841,7 @@
     <w:p/>
     <w:p>
       <w:r>
-        <w:t xml:space="preserve">¡Listo! Quedo **en espera mañana** para empezar con el mantenimiento de Operaciones. </w:t>
-      </w:r>
-      <w:proofErr w:type="gramStart"/>
-      <w:r>
-        <w:t>Descansa y hasta entonces!</w:t>
-      </w:r>
-      <w:proofErr w:type="gramEnd"/>
-      <w:r>
-        <w:t xml:space="preserve"> </w:t>
+        <w:t xml:space="preserve">¡Listo! Quedo **en espera mañana** para empezar con el mantenimiento de Operaciones. Descansa y hasta entonces! </w:t>
       </w:r>
       <w:r>
         <w:rPr>
@@ -873,6 +849,25 @@
         </w:rPr>
         <w:t>😊</w:t>
       </w:r>
+    </w:p>
+    <w:p>
+      <w:r>
+        <w:t>Repositorio:</w:t>
+      </w:r>
+      <w:r>
+        <w:br/>
+      </w:r>
+      <w:r>
+        <w:br/>
+      </w:r>
+      <w:hyperlink r:id="rId5" w:history="1">
+        <w:r>
+          <w:rPr>
+            <w:rStyle w:val="Hipervnculo"/>
+          </w:rPr>
+          <w:t>https://github.com/pfzambranog/DesarrollosVisual.git</w:t>
+        </w:r>
+      </w:hyperlink>
     </w:p>
     <w:p/>
     <w:sectPr>
@@ -1877,6 +1872,7 @@
   <w:style w:type="character" w:default="1" w:styleId="Fuentedeprrafopredeter">
     <w:name w:val="Default Paragraph Font"/>
     <w:uiPriority w:val="1"/>
+    <w:semiHidden/>
     <w:unhideWhenUsed/>
   </w:style>
   <w:style w:type="table" w:default="1" w:styleId="Tablanormal">
@@ -2188,6 +2184,29 @@
       <w:smallCaps/>
       <w:color w:val="0F4761" w:themeColor="accent1" w:themeShade="BF"/>
       <w:spacing w:val="5"/>
+    </w:rPr>
+  </w:style>
+  <w:style w:type="character" w:styleId="Hipervnculo">
+    <w:name w:val="Hyperlink"/>
+    <w:basedOn w:val="Fuentedeprrafopredeter"/>
+    <w:uiPriority w:val="99"/>
+    <w:unhideWhenUsed/>
+    <w:rsid w:val="005C35D3"/>
+    <w:rPr>
+      <w:color w:val="467886" w:themeColor="hyperlink"/>
+      <w:u w:val="single"/>
+    </w:rPr>
+  </w:style>
+  <w:style w:type="character" w:styleId="Mencinsinresolver">
+    <w:name w:val="Unresolved Mention"/>
+    <w:basedOn w:val="Fuentedeprrafopredeter"/>
+    <w:uiPriority w:val="99"/>
+    <w:semiHidden/>
+    <w:unhideWhenUsed/>
+    <w:rsid w:val="005C35D3"/>
+    <w:rPr>
+      <w:color w:val="605E5C"/>
+      <w:shd w:val="clear" w:color="auto" w:fill="E1DFDD"/>
     </w:rPr>
   </w:style>
 </w:styles>

</xml_diff>

<commit_message>
Actualizacion de la interface visual de SCMBD. Catalogo de Menues.
</commit_message>
<xml_diff>
--- a/SCMBD/Documentos/Avances SCMBD - 2026-09-04.docx
+++ b/SCMBD/Documentos/Avances SCMBD - 2026-09-04.docx
@@ -10,10 +10,439 @@
         <w:rPr>
           <w:rFonts w:ascii="Segoe UI Emoji" w:hAnsi="Segoe UI Emoji" w:cs="Segoe UI Emoji"/>
         </w:rPr>
-        <w:t>📌</w:t>
-      </w:r>
-      <w:r>
-        <w:t xml:space="preserve"> ¡Excelente cierre por hoy! </w:t>
+        <w:t>✅</w:t>
+      </w:r>
+      <w:r>
+        <w:t xml:space="preserve"> </w:t>
+      </w:r>
+      <w:r>
+        <w:rPr>
+          <w:rFonts w:ascii="Segoe UI Emoji" w:hAnsi="Segoe UI Emoji" w:cs="Segoe UI Emoji"/>
+        </w:rPr>
+        <w:t>📊</w:t>
+      </w:r>
+      <w:r>
+        <w:t xml:space="preserve"> Resumen de Avances — Sesión 2026-09-08</w:t>
+      </w:r>
+    </w:p>
+    <w:p/>
+    <w:p>
+      <w:r>
+        <w:t>---</w:t>
+      </w:r>
+    </w:p>
+    <w:p/>
+    <w:p>
+      <w:r>
+        <w:t xml:space="preserve">## </w:t>
+      </w:r>
+      <w:r>
+        <w:rPr>
+          <w:rFonts w:ascii="Segoe UI Emoji" w:hAnsi="Segoe UI Emoji" w:cs="Segoe UI Emoji"/>
+        </w:rPr>
+        <w:t>✅</w:t>
+      </w:r>
+      <w:r>
+        <w:t xml:space="preserve"> Logros Completados</w:t>
+      </w:r>
+    </w:p>
+    <w:p/>
+    <w:p>
+      <w:r>
+        <w:t>| # | Componente | Estado |</w:t>
+      </w:r>
+    </w:p>
+    <w:p>
+      <w:r>
+        <w:t>|---|---|---|</w:t>
+      </w:r>
+    </w:p>
+    <w:p>
+      <w:r>
+        <w:t>| 1 | **</w:t>
+      </w:r>
+      <w:proofErr w:type="spellStart"/>
+      <w:r>
+        <w:t>FrmManOperaciones</w:t>
+      </w:r>
+      <w:proofErr w:type="spellEnd"/>
+      <w:r>
+        <w:t xml:space="preserve">** — Mantenimiento de catálogo de Operaciones | </w:t>
+      </w:r>
+      <w:r>
+        <w:rPr>
+          <w:rFonts w:ascii="Segoe UI Emoji" w:hAnsi="Segoe UI Emoji" w:cs="Segoe UI Emoji"/>
+        </w:rPr>
+        <w:t>✅</w:t>
+      </w:r>
+      <w:r>
+        <w:t xml:space="preserve"> Funcionando completo |</w:t>
+      </w:r>
+    </w:p>
+    <w:p>
+      <w:r>
+        <w:t xml:space="preserve">| 2 | Constructor recibe **6 parámetros** desde el Menú | </w:t>
+      </w:r>
+      <w:r>
+        <w:rPr>
+          <w:rFonts w:ascii="Segoe UI Emoji" w:hAnsi="Segoe UI Emoji" w:cs="Segoe UI Emoji"/>
+        </w:rPr>
+        <w:t>✅</w:t>
+      </w:r>
+      <w:r>
+        <w:t xml:space="preserve"> `</w:t>
+      </w:r>
+      <w:proofErr w:type="spellStart"/>
+      <w:r>
+        <w:t>idUsuario</w:t>
+      </w:r>
+      <w:proofErr w:type="spellEnd"/>
+      <w:r>
+        <w:t xml:space="preserve">, </w:t>
+      </w:r>
+      <w:proofErr w:type="spellStart"/>
+      <w:r>
+        <w:t>claveUsuario</w:t>
+      </w:r>
+      <w:proofErr w:type="spellEnd"/>
+      <w:r>
+        <w:t xml:space="preserve">, </w:t>
+      </w:r>
+      <w:proofErr w:type="spellStart"/>
+      <w:r>
+        <w:t>dtPermisos</w:t>
+      </w:r>
+      <w:proofErr w:type="spellEnd"/>
+      <w:r>
+        <w:t xml:space="preserve">, </w:t>
+      </w:r>
+      <w:proofErr w:type="spellStart"/>
+      <w:r>
+        <w:t>claveOperacion</w:t>
+      </w:r>
+      <w:proofErr w:type="spellEnd"/>
+      <w:r>
+        <w:t xml:space="preserve">, </w:t>
+      </w:r>
+      <w:proofErr w:type="spellStart"/>
+      <w:r>
+        <w:t>nombreOperacion</w:t>
+      </w:r>
+      <w:proofErr w:type="spellEnd"/>
+      <w:r>
+        <w:t xml:space="preserve">, </w:t>
+      </w:r>
+      <w:proofErr w:type="spellStart"/>
+      <w:r>
+        <w:t>cadenaConexion</w:t>
+      </w:r>
+      <w:proofErr w:type="spellEnd"/>
+      <w:r>
+        <w:t>` |</w:t>
+      </w:r>
+    </w:p>
+    <w:p>
+      <w:r>
+        <w:t xml:space="preserve">| 3 | Título de pantalla = **Nombre de la operación** del Menú | </w:t>
+      </w:r>
+      <w:r>
+        <w:rPr>
+          <w:rFonts w:ascii="Segoe UI Emoji" w:hAnsi="Segoe UI Emoji" w:cs="Segoe UI Emoji"/>
+        </w:rPr>
+        <w:t>✅</w:t>
+      </w:r>
+      <w:r>
+        <w:t xml:space="preserve"> `</w:t>
+      </w:r>
+      <w:proofErr w:type="spellStart"/>
+      <w:r>
+        <w:t>this.Text</w:t>
+      </w:r>
+      <w:proofErr w:type="spellEnd"/>
+      <w:r>
+        <w:t xml:space="preserve"> = _</w:t>
+      </w:r>
+      <w:proofErr w:type="spellStart"/>
+      <w:r>
+        <w:t>nombreOperacion</w:t>
+      </w:r>
+      <w:proofErr w:type="spellEnd"/>
+      <w:r>
+        <w:t>;` |</w:t>
+      </w:r>
+    </w:p>
+    <w:p>
+      <w:r>
+        <w:t>| 4 | Encabezado = **Clave + Nombre** (</w:t>
+      </w:r>
+      <w:proofErr w:type="spellStart"/>
+      <w:r>
+        <w:t>ej</w:t>
+      </w:r>
+      <w:proofErr w:type="spellEnd"/>
+      <w:r>
+        <w:t xml:space="preserve">: `"CATOPE01 - Mantenimiento Catálogo..."`) | </w:t>
+      </w:r>
+      <w:r>
+        <w:rPr>
+          <w:rFonts w:ascii="Segoe UI Emoji" w:hAnsi="Segoe UI Emoji" w:cs="Segoe UI Emoji"/>
+        </w:rPr>
+        <w:t>✅</w:t>
+      </w:r>
+      <w:r>
+        <w:t xml:space="preserve"> |</w:t>
+      </w:r>
+    </w:p>
+    <w:p>
+      <w:r>
+        <w:t xml:space="preserve">| 5 | SP Alta → **SIN** `@PnIdEstatus` (usa DEFAULT 1 de la tabla) | </w:t>
+      </w:r>
+      <w:r>
+        <w:rPr>
+          <w:rFonts w:ascii="Segoe UI Emoji" w:hAnsi="Segoe UI Emoji" w:cs="Segoe UI Emoji"/>
+        </w:rPr>
+        <w:t>✅</w:t>
+      </w:r>
+      <w:r>
+        <w:t xml:space="preserve"> |</w:t>
+      </w:r>
+    </w:p>
+    <w:p>
+      <w:r>
+        <w:t xml:space="preserve">| 6 | SP Modifica → **CON** `@PnIdEstatus` | </w:t>
+      </w:r>
+      <w:r>
+        <w:rPr>
+          <w:rFonts w:ascii="Segoe UI Emoji" w:hAnsi="Segoe UI Emoji" w:cs="Segoe UI Emoji"/>
+        </w:rPr>
+        <w:t>✅</w:t>
+      </w:r>
+      <w:r>
+        <w:t xml:space="preserve"> |</w:t>
+      </w:r>
+    </w:p>
+    <w:p>
+      <w:r>
+        <w:t>| 7 | `</w:t>
+      </w:r>
+      <w:proofErr w:type="spellStart"/>
+      <w:r>
+        <w:t>BtnRefrescar_Click</w:t>
+      </w:r>
+      <w:proofErr w:type="spellEnd"/>
+      <w:r>
+        <w:t xml:space="preserve">` → **Primero recarga </w:t>
+      </w:r>
+      <w:proofErr w:type="spellStart"/>
+      <w:r>
+        <w:t>grid</w:t>
+      </w:r>
+      <w:proofErr w:type="spellEnd"/>
+      <w:r>
+        <w:t xml:space="preserve"> → luego limpia campos** (estándar adoptado) | </w:t>
+      </w:r>
+      <w:r>
+        <w:rPr>
+          <w:rFonts w:ascii="Segoe UI Emoji" w:hAnsi="Segoe UI Emoji" w:cs="Segoe UI Emoji"/>
+        </w:rPr>
+        <w:t>✅</w:t>
+      </w:r>
+      <w:r>
+        <w:t xml:space="preserve"> |</w:t>
+      </w:r>
+    </w:p>
+    <w:p>
+      <w:r>
+        <w:t xml:space="preserve">| 8 | Exportación Excel → **Título dinámico** como parámetro al servicio | </w:t>
+      </w:r>
+      <w:r>
+        <w:rPr>
+          <w:rFonts w:ascii="Segoe UI Emoji" w:hAnsi="Segoe UI Emoji" w:cs="Segoe UI Emoji"/>
+        </w:rPr>
+        <w:t>✅</w:t>
+      </w:r>
+      <w:r>
+        <w:t xml:space="preserve"> |</w:t>
+      </w:r>
+    </w:p>
+    <w:p>
+      <w:r>
+        <w:t xml:space="preserve">| 9 | Botón Procesar → Habilita según **nivel de autorización ≥ 4** | </w:t>
+      </w:r>
+      <w:r>
+        <w:rPr>
+          <w:rFonts w:ascii="Segoe UI Emoji" w:hAnsi="Segoe UI Emoji" w:cs="Segoe UI Emoji"/>
+        </w:rPr>
+        <w:t>✅</w:t>
+      </w:r>
+      <w:r>
+        <w:t xml:space="preserve"> |</w:t>
+      </w:r>
+    </w:p>
+    <w:p>
+      <w:r>
+        <w:t>| 10 | **</w:t>
+      </w:r>
+      <w:proofErr w:type="spellStart"/>
+      <w:r>
+        <w:t>FrmMenuPrincipal</w:t>
+      </w:r>
+      <w:proofErr w:type="spellEnd"/>
+      <w:r>
+        <w:t>** actualizado → guarda `</w:t>
+      </w:r>
+      <w:proofErr w:type="spellStart"/>
+      <w:r>
+        <w:t>claveOperacion</w:t>
+      </w:r>
+      <w:proofErr w:type="spellEnd"/>
+      <w:r>
+        <w:t>` y `</w:t>
+      </w:r>
+      <w:proofErr w:type="spellStart"/>
+      <w:r>
+        <w:t>nombreOperacion</w:t>
+      </w:r>
+      <w:proofErr w:type="spellEnd"/>
+      <w:r>
+        <w:t xml:space="preserve">` en el `Tag` | </w:t>
+      </w:r>
+      <w:r>
+        <w:rPr>
+          <w:rFonts w:ascii="Segoe UI Emoji" w:hAnsi="Segoe UI Emoji" w:cs="Segoe UI Emoji"/>
+        </w:rPr>
+        <w:t>✅</w:t>
+      </w:r>
+      <w:r>
+        <w:t xml:space="preserve"> |</w:t>
+      </w:r>
+    </w:p>
+    <w:p>
+      <w:r>
+        <w:t>| 11 | `</w:t>
+      </w:r>
+      <w:proofErr w:type="spellStart"/>
+      <w:r>
+        <w:t>AbrirPantallaSeleccionada</w:t>
+      </w:r>
+      <w:proofErr w:type="spellEnd"/>
+      <w:r>
+        <w:t xml:space="preserve">` → **Detecta automáticamente** constructor de 5 o 6 parámetros | </w:t>
+      </w:r>
+      <w:r>
+        <w:rPr>
+          <w:rFonts w:ascii="Segoe UI Emoji" w:hAnsi="Segoe UI Emoji" w:cs="Segoe UI Emoji"/>
+        </w:rPr>
+        <w:t>✅</w:t>
+      </w:r>
+      <w:r>
+        <w:t xml:space="preserve"> Compatibilidad total con pantallas anteriores |</w:t>
+      </w:r>
+    </w:p>
+    <w:p>
+      <w:r>
+        <w:t>| 12 | **</w:t>
+      </w:r>
+      <w:proofErr w:type="spellStart"/>
+      <w:r>
+        <w:t>FrmManUsuarios</w:t>
+      </w:r>
+      <w:proofErr w:type="spellEnd"/>
+      <w:r>
+        <w:t xml:space="preserve">** — Ajustes visuales, columnas del </w:t>
+      </w:r>
+      <w:proofErr w:type="spellStart"/>
+      <w:r>
+        <w:t>grid</w:t>
+      </w:r>
+      <w:proofErr w:type="spellEnd"/>
+      <w:r>
+        <w:t xml:space="preserve">, validaciones | </w:t>
+      </w:r>
+      <w:r>
+        <w:rPr>
+          <w:rFonts w:ascii="Segoe UI Emoji" w:hAnsi="Segoe UI Emoji" w:cs="Segoe UI Emoji"/>
+        </w:rPr>
+        <w:t>✅</w:t>
+      </w:r>
+      <w:r>
+        <w:t xml:space="preserve"> Funcionando |</w:t>
+      </w:r>
+    </w:p>
+    <w:p>
+      <w:r>
+        <w:t xml:space="preserve">| 13 | Altas, Bajas (cambio de estatus, SIN borrado físico) y Actualizaciones | </w:t>
+      </w:r>
+      <w:r>
+        <w:rPr>
+          <w:rFonts w:ascii="Segoe UI Emoji" w:hAnsi="Segoe UI Emoji" w:cs="Segoe UI Emoji"/>
+        </w:rPr>
+        <w:t>✅</w:t>
+      </w:r>
+      <w:r>
+        <w:t xml:space="preserve"> Ambos formularios |</w:t>
+      </w:r>
+    </w:p>
+    <w:p/>
+    <w:p>
+      <w:r>
+        <w:t>---</w:t>
+      </w:r>
+    </w:p>
+    <w:p/>
+    <w:p>
+      <w:r>
+        <w:t xml:space="preserve">## </w:t>
+      </w:r>
+      <w:r>
+        <w:rPr>
+          <w:rFonts w:ascii="Segoe UI Emoji" w:hAnsi="Segoe UI Emoji" w:cs="Segoe UI Emoji"/>
+        </w:rPr>
+        <w:t>📅</w:t>
+      </w:r>
+      <w:r>
+        <w:t xml:space="preserve"> Próxima Sesión</w:t>
+      </w:r>
+    </w:p>
+    <w:p/>
+    <w:p>
+      <w:r>
+        <w:t>&gt; **</w:t>
+      </w:r>
+      <w:r>
+        <w:rPr>
+          <w:rFonts w:ascii="Segoe UI Emoji" w:hAnsi="Segoe UI Emoji" w:cs="Segoe UI Emoji"/>
+        </w:rPr>
+        <w:t>🔧</w:t>
+      </w:r>
+      <w:r>
+        <w:t xml:space="preserve"> </w:t>
+      </w:r>
+      <w:proofErr w:type="spellStart"/>
+      <w:r>
+        <w:t>catMenusTbl</w:t>
+      </w:r>
+      <w:proofErr w:type="spellEnd"/>
+      <w:r>
+        <w:t>** — Mantenimiento de Tabla de Menús</w:t>
+      </w:r>
+    </w:p>
+    <w:p/>
+    <w:p>
+      <w:r>
+        <w:t>---</w:t>
+      </w:r>
+    </w:p>
+    <w:p/>
+    <w:p>
+      <w:r>
+        <w:rPr>
+          <w:rFonts w:ascii="Segoe UI Emoji" w:hAnsi="Segoe UI Emoji" w:cs="Segoe UI Emoji"/>
+        </w:rPr>
+        <w:t>✅</w:t>
+      </w:r>
+      <w:r>
+        <w:t xml:space="preserve"> **Todo funcional y confirmado.** Nos vemos en la próxima sesión con el mantenimiento de **Menús**. ¡Excelente avance! </w:t>
       </w:r>
       <w:r>
         <w:rPr>
@@ -22,854 +451,6 @@
         <w:t>🎉</w:t>
       </w:r>
     </w:p>
-    <w:p/>
-    <w:p>
-      <w:r>
-        <w:t>Queda todo registrado para la **próxima sesión**:</w:t>
-      </w:r>
-    </w:p>
-    <w:p/>
-    <w:p>
-      <w:r>
-        <w:t>---</w:t>
-      </w:r>
-    </w:p>
-    <w:p/>
-    <w:p>
-      <w:r>
-        <w:t xml:space="preserve">## </w:t>
-      </w:r>
-      <w:r>
-        <w:rPr>
-          <w:rFonts w:ascii="Segoe UI Emoji" w:hAnsi="Segoe UI Emoji" w:cs="Segoe UI Emoji"/>
-        </w:rPr>
-        <w:t>📋</w:t>
-      </w:r>
-      <w:r>
-        <w:t xml:space="preserve"> Resumen — Para continuar mañana</w:t>
-      </w:r>
-    </w:p>
-    <w:p/>
-    <w:p>
-      <w:r>
-        <w:t xml:space="preserve">### </w:t>
-      </w:r>
-      <w:r>
-        <w:rPr>
-          <w:rFonts w:ascii="Segoe UI Emoji" w:hAnsi="Segoe UI Emoji" w:cs="Segoe UI Emoji"/>
-        </w:rPr>
-        <w:t>📄</w:t>
-      </w:r>
-      <w:r>
-        <w:t xml:space="preserve"> Pantalla</w:t>
-      </w:r>
-    </w:p>
-    <w:p>
-      <w:r>
-        <w:t>- **</w:t>
-      </w:r>
-      <w:proofErr w:type="gramStart"/>
-      <w:r>
-        <w:t>Nombre:*</w:t>
-      </w:r>
-      <w:proofErr w:type="gramEnd"/>
-      <w:r>
-        <w:t>* `</w:t>
-      </w:r>
-      <w:proofErr w:type="spellStart"/>
-      <w:r>
-        <w:t>FrmManOperaciones</w:t>
-      </w:r>
-      <w:proofErr w:type="spellEnd"/>
-      <w:r>
-        <w:t>` → Espacio de nombres: `</w:t>
-      </w:r>
-      <w:proofErr w:type="spellStart"/>
-      <w:r>
-        <w:t>SCMBD.FrmManOperaciones</w:t>
-      </w:r>
-      <w:proofErr w:type="spellEnd"/>
-      <w:r>
-        <w:t>`</w:t>
-      </w:r>
-    </w:p>
-    <w:p>
-      <w:r>
-        <w:t>- **</w:t>
-      </w:r>
-      <w:proofErr w:type="gramStart"/>
-      <w:r>
-        <w:t>Operación:*</w:t>
-      </w:r>
-      <w:proofErr w:type="gramEnd"/>
-      <w:r>
-        <w:t>* `CATOPER01`</w:t>
-      </w:r>
-    </w:p>
-    <w:p>
-      <w:r>
-        <w:t>- **</w:t>
-      </w:r>
-      <w:proofErr w:type="gramStart"/>
-      <w:r>
-        <w:t>Diseño:*</w:t>
-      </w:r>
-      <w:proofErr w:type="gramEnd"/>
-      <w:r>
-        <w:t>* Misma estructura que `</w:t>
-      </w:r>
-      <w:proofErr w:type="spellStart"/>
-      <w:r>
-        <w:t>FrmManUser</w:t>
-      </w:r>
-      <w:proofErr w:type="spellEnd"/>
-      <w:r>
-        <w:t>` (encabezado, formulario de campos, Grid, botones Refrescar/Procesar/Excel/Salir)</w:t>
-      </w:r>
-    </w:p>
-    <w:p/>
-    <w:p>
-      <w:r>
-        <w:t xml:space="preserve">### </w:t>
-      </w:r>
-      <w:r>
-        <w:rPr>
-          <w:rFonts w:ascii="Segoe UI Emoji" w:hAnsi="Segoe UI Emoji" w:cs="Segoe UI Emoji"/>
-        </w:rPr>
-        <w:t>📊</w:t>
-      </w:r>
-      <w:r>
-        <w:t xml:space="preserve"> Tabla: `</w:t>
-      </w:r>
-      <w:proofErr w:type="spellStart"/>
-      <w:proofErr w:type="gramStart"/>
-      <w:r>
-        <w:t>dbo.catOperacionesTbl</w:t>
-      </w:r>
-      <w:proofErr w:type="spellEnd"/>
-      <w:proofErr w:type="gramEnd"/>
-      <w:r>
-        <w:t>`</w:t>
-      </w:r>
-    </w:p>
-    <w:p/>
-    <w:p>
-      <w:r>
-        <w:t>| Campo | Tipo | Descripción |</w:t>
-      </w:r>
-    </w:p>
-    <w:p>
-      <w:r>
-        <w:t>|---|---|---|</w:t>
-      </w:r>
-    </w:p>
-    <w:p>
-      <w:r>
-        <w:t xml:space="preserve">| </w:t>
-      </w:r>
-      <w:proofErr w:type="spellStart"/>
-      <w:r>
-        <w:t>idOperacion</w:t>
-      </w:r>
-      <w:proofErr w:type="spellEnd"/>
-      <w:r>
-        <w:t xml:space="preserve"> | INT, </w:t>
-      </w:r>
-      <w:proofErr w:type="gramStart"/>
-      <w:r>
-        <w:t>IDENTITY(</w:t>
-      </w:r>
-      <w:proofErr w:type="gramEnd"/>
-      <w:r>
-        <w:t>1,1) | Clave correlativa |</w:t>
-      </w:r>
-    </w:p>
-    <w:p>
-      <w:r>
-        <w:t xml:space="preserve">| </w:t>
-      </w:r>
-      <w:proofErr w:type="spellStart"/>
-      <w:r>
-        <w:t>operacion</w:t>
-      </w:r>
-      <w:proofErr w:type="spellEnd"/>
-      <w:r>
-        <w:t xml:space="preserve"> | </w:t>
-      </w:r>
-      <w:proofErr w:type="gramStart"/>
-      <w:r>
-        <w:t>VARCHAR(</w:t>
-      </w:r>
-      <w:proofErr w:type="gramEnd"/>
-      <w:r>
-        <w:t>20) | Código de operación (ej. SU1999) |</w:t>
-      </w:r>
-    </w:p>
-    <w:p>
-      <w:r>
-        <w:t xml:space="preserve">| </w:t>
-      </w:r>
-      <w:proofErr w:type="spellStart"/>
-      <w:r>
-        <w:t>descripcion</w:t>
-      </w:r>
-      <w:proofErr w:type="spellEnd"/>
-      <w:r>
-        <w:t xml:space="preserve"> | </w:t>
-      </w:r>
-      <w:proofErr w:type="gramStart"/>
-      <w:r>
-        <w:t>VARCHAR(</w:t>
-      </w:r>
-      <w:proofErr w:type="gramEnd"/>
-      <w:r>
-        <w:t>100) | Nombre de la operación |</w:t>
-      </w:r>
-    </w:p>
-    <w:p>
-      <w:r>
-        <w:t xml:space="preserve">| llamada | </w:t>
-      </w:r>
-      <w:proofErr w:type="gramStart"/>
-      <w:r>
-        <w:t>VARCHAR(</w:t>
-      </w:r>
-      <w:proofErr w:type="gramEnd"/>
-      <w:r>
-        <w:t>40) | Nombre del formulario a llamar |</w:t>
-      </w:r>
-    </w:p>
-    <w:p>
-      <w:r>
-        <w:t xml:space="preserve">| ruta | </w:t>
-      </w:r>
-      <w:proofErr w:type="gramStart"/>
-      <w:r>
-        <w:t>VARCHAR(</w:t>
-      </w:r>
-      <w:proofErr w:type="gramEnd"/>
-      <w:r>
-        <w:t>512) | Espacio de nombres / ruta |</w:t>
-      </w:r>
-    </w:p>
-    <w:p>
-      <w:r>
-        <w:t xml:space="preserve">| </w:t>
-      </w:r>
-      <w:proofErr w:type="spellStart"/>
-      <w:r>
-        <w:t>idEstatus</w:t>
-      </w:r>
-      <w:proofErr w:type="spellEnd"/>
-      <w:r>
-        <w:t xml:space="preserve"> | BIT | 1 = Activo, 0 = Inactivo |</w:t>
-      </w:r>
-    </w:p>
-    <w:p>
-      <w:r>
-        <w:t xml:space="preserve">| </w:t>
-      </w:r>
-      <w:proofErr w:type="spellStart"/>
-      <w:r>
-        <w:t>idUsuarioAct</w:t>
-      </w:r>
-      <w:proofErr w:type="spellEnd"/>
-      <w:r>
-        <w:t xml:space="preserve"> | INT | Usuario de última modificación |</w:t>
-      </w:r>
-    </w:p>
-    <w:p>
-      <w:r>
-        <w:t xml:space="preserve">| </w:t>
-      </w:r>
-      <w:proofErr w:type="spellStart"/>
-      <w:r>
-        <w:t>fechaAct</w:t>
-      </w:r>
-      <w:proofErr w:type="spellEnd"/>
-      <w:r>
-        <w:t xml:space="preserve"> | DATETIME | Fecha de modificación |</w:t>
-      </w:r>
-    </w:p>
-    <w:p>
-      <w:r>
-        <w:t xml:space="preserve">| </w:t>
-      </w:r>
-      <w:proofErr w:type="spellStart"/>
-      <w:r>
-        <w:t>ipAct</w:t>
-      </w:r>
-      <w:proofErr w:type="spellEnd"/>
-      <w:r>
-        <w:t xml:space="preserve"> / </w:t>
-      </w:r>
-      <w:proofErr w:type="spellStart"/>
-      <w:r>
-        <w:t>macAddressAct</w:t>
-      </w:r>
-      <w:proofErr w:type="spellEnd"/>
-      <w:r>
-        <w:t xml:space="preserve"> | VARCHAR | Datos de conexión |</w:t>
-      </w:r>
-    </w:p>
-    <w:p/>
-    <w:p>
-      <w:r>
-        <w:lastRenderedPageBreak/>
-        <w:t xml:space="preserve">### </w:t>
-      </w:r>
-      <w:r>
-        <w:rPr>
-          <w:rFonts w:ascii="Segoe UI Emoji" w:hAnsi="Segoe UI Emoji" w:cs="Segoe UI Emoji"/>
-        </w:rPr>
-        <w:t>⚙️</w:t>
-      </w:r>
-      <w:r>
-        <w:t xml:space="preserve"> Procedimientos Almacenados</w:t>
-      </w:r>
-    </w:p>
-    <w:p>
-      <w:r>
-        <w:t>- **</w:t>
-      </w:r>
-      <w:proofErr w:type="gramStart"/>
-      <w:r>
-        <w:t>Alta:*</w:t>
-      </w:r>
-      <w:proofErr w:type="gramEnd"/>
-      <w:r>
-        <w:t>* `</w:t>
-      </w:r>
-      <w:proofErr w:type="spellStart"/>
-      <w:proofErr w:type="gramStart"/>
-      <w:r>
-        <w:t>dbo.Spa</w:t>
-      </w:r>
-      <w:proofErr w:type="gramEnd"/>
-      <w:r>
-        <w:t>_catOperacionesTbl</w:t>
-      </w:r>
-      <w:proofErr w:type="spellEnd"/>
-      <w:r>
-        <w:t>` → Nuevo registro (</w:t>
-      </w:r>
-      <w:proofErr w:type="spellStart"/>
-      <w:r>
-        <w:t>idOperacion</w:t>
-      </w:r>
-      <w:proofErr w:type="spellEnd"/>
-      <w:r>
-        <w:t xml:space="preserve"> = 0)</w:t>
-      </w:r>
-    </w:p>
-    <w:p>
-      <w:r>
-        <w:t>- **</w:t>
-      </w:r>
-      <w:proofErr w:type="gramStart"/>
-      <w:r>
-        <w:t>Modificación:*</w:t>
-      </w:r>
-      <w:proofErr w:type="gramEnd"/>
-      <w:r>
-        <w:t>* `</w:t>
-      </w:r>
-      <w:proofErr w:type="spellStart"/>
-      <w:proofErr w:type="gramStart"/>
-      <w:r>
-        <w:t>dbo.Spu</w:t>
-      </w:r>
-      <w:proofErr w:type="gramEnd"/>
-      <w:r>
-        <w:t>_catOperacionesTbl</w:t>
-      </w:r>
-      <w:proofErr w:type="spellEnd"/>
-      <w:r>
-        <w:t>` → Por desarrollar</w:t>
-      </w:r>
-    </w:p>
-    <w:p>
-      <w:r>
-        <w:t>- **</w:t>
-      </w:r>
-      <w:proofErr w:type="gramStart"/>
-      <w:r>
-        <w:t>Eliminación:*</w:t>
-      </w:r>
-      <w:proofErr w:type="gramEnd"/>
-      <w:r>
-        <w:t xml:space="preserve">* </w:t>
-      </w:r>
-      <w:r>
-        <w:rPr>
-          <w:rFonts w:ascii="Segoe UI Emoji" w:hAnsi="Segoe UI Emoji" w:cs="Segoe UI Emoji"/>
-        </w:rPr>
-        <w:t>❌</w:t>
-      </w:r>
-      <w:r>
-        <w:t xml:space="preserve"> **NO hay borrado f</w:t>
-      </w:r>
-      <w:r>
-        <w:rPr>
-          <w:rFonts w:ascii="Aptos" w:hAnsi="Aptos" w:cs="Aptos"/>
-        </w:rPr>
-        <w:t>í</w:t>
-      </w:r>
-      <w:r>
-        <w:t xml:space="preserve">sico** </w:t>
-      </w:r>
-      <w:r>
-        <w:rPr>
-          <w:rFonts w:ascii="Aptos" w:hAnsi="Aptos" w:cs="Aptos"/>
-        </w:rPr>
-        <w:t>→</w:t>
-      </w:r>
-      <w:r>
-        <w:t xml:space="preserve"> solo cambio de estatus (Activo/Inactivo)</w:t>
-      </w:r>
-    </w:p>
-    <w:p/>
-    <w:p>
-      <w:r>
-        <w:t xml:space="preserve">### </w:t>
-      </w:r>
-      <w:r>
-        <w:rPr>
-          <w:rFonts w:ascii="Segoe UI Emoji" w:hAnsi="Segoe UI Emoji" w:cs="Segoe UI Emoji"/>
-        </w:rPr>
-        <w:t>📝</w:t>
-      </w:r>
-      <w:r>
-        <w:t xml:space="preserve"> Parámetros del SP de Alta</w:t>
-      </w:r>
-    </w:p>
-    <w:p>
-      <w:r>
-        <w:t>```</w:t>
-      </w:r>
-    </w:p>
-    <w:p>
-      <w:r>
-        <w:t xml:space="preserve">@PsOperacion      </w:t>
-      </w:r>
-      <w:proofErr w:type="gramStart"/>
-      <w:r>
-        <w:t>VARCHAR(</w:t>
-      </w:r>
-      <w:proofErr w:type="gramEnd"/>
-      <w:r>
-        <w:t>20)   → Código ej. "SU1999"</w:t>
-      </w:r>
-    </w:p>
-    <w:p>
-      <w:r>
-        <w:t xml:space="preserve">@PsDescripcion    </w:t>
-      </w:r>
-      <w:proofErr w:type="gramStart"/>
-      <w:r>
-        <w:t>VARCHAR(</w:t>
-      </w:r>
-      <w:proofErr w:type="gramEnd"/>
-      <w:r>
-        <w:t>100</w:t>
-      </w:r>
-      <w:proofErr w:type="gramStart"/>
-      <w:r>
-        <w:t>)  →</w:t>
-      </w:r>
-      <w:proofErr w:type="gramEnd"/>
-      <w:r>
-        <w:t xml:space="preserve"> Nombre ej. "Cambio de Contraseña"</w:t>
-      </w:r>
-    </w:p>
-    <w:p>
-      <w:r>
-        <w:t xml:space="preserve">@PsLlamada        </w:t>
-      </w:r>
-      <w:proofErr w:type="gramStart"/>
-      <w:r>
-        <w:t>VARCHAR(</w:t>
-      </w:r>
-      <w:proofErr w:type="gramEnd"/>
-      <w:r>
-        <w:t>40)   → Formulario ej. "</w:t>
-      </w:r>
-      <w:proofErr w:type="spellStart"/>
-      <w:r>
-        <w:t>FrmCambioContrasenia</w:t>
-      </w:r>
-      <w:proofErr w:type="spellEnd"/>
-      <w:r>
-        <w:t>"</w:t>
-      </w:r>
-    </w:p>
-    <w:p>
-      <w:r>
-        <w:t xml:space="preserve">@PsRutas          </w:t>
-      </w:r>
-      <w:proofErr w:type="gramStart"/>
-      <w:r>
-        <w:t>VARCHAR(</w:t>
-      </w:r>
-      <w:proofErr w:type="gramEnd"/>
-      <w:r>
-        <w:t>512</w:t>
-      </w:r>
-      <w:proofErr w:type="gramStart"/>
-      <w:r>
-        <w:t>)  →</w:t>
-      </w:r>
-      <w:proofErr w:type="gramEnd"/>
-      <w:r>
-        <w:t xml:space="preserve"> Ruta ej. "SCMBD"</w:t>
-      </w:r>
-    </w:p>
-    <w:p>
-      <w:r>
-        <w:t>@PnIdOperacion    INT           → 0 = Alta, &gt;0 = Modificación</w:t>
-      </w:r>
-    </w:p>
-    <w:p>
-      <w:r>
-        <w:t>@PnIdUsuarioAct   INT           → ID del usuario actual</w:t>
-      </w:r>
-    </w:p>
-    <w:p>
-      <w:r>
-        <w:t>@PsIpAct / @PsMacAddressAct     → Se obtienen automáticamente</w:t>
-      </w:r>
-    </w:p>
-    <w:p>
-      <w:r>
-        <w:t>@PnEstatus        INT (</w:t>
-      </w:r>
-      <w:proofErr w:type="gramStart"/>
-      <w:r>
-        <w:t xml:space="preserve">OUT)   </w:t>
-      </w:r>
-      <w:proofErr w:type="gramEnd"/>
-      <w:r>
-        <w:t xml:space="preserve">  → 0 = Éxito, ≠0 = Error</w:t>
-      </w:r>
-    </w:p>
-    <w:p>
-      <w:r>
-        <w:t>@PsMensaje        VARCHAR(250)  → Mensaje desde BD</w:t>
-      </w:r>
-    </w:p>
-    <w:p>
-      <w:r>
-        <w:t>```</w:t>
-      </w:r>
-    </w:p>
-    <w:p/>
-    <w:p>
-      <w:r>
-        <w:t xml:space="preserve">### </w:t>
-      </w:r>
-      <w:r>
-        <w:rPr>
-          <w:rFonts w:ascii="Segoe UI Emoji" w:hAnsi="Segoe UI Emoji" w:cs="Segoe UI Emoji"/>
-        </w:rPr>
-        <w:t>🎯</w:t>
-      </w:r>
-      <w:r>
-        <w:t xml:space="preserve"> Reglas Clave</w:t>
-      </w:r>
-    </w:p>
-    <w:p>
-      <w:r>
-        <w:t xml:space="preserve">- </w:t>
-      </w:r>
-      <w:r>
-        <w:rPr>
-          <w:rFonts w:ascii="Segoe UI Emoji" w:hAnsi="Segoe UI Emoji" w:cs="Segoe UI Emoji"/>
-        </w:rPr>
-        <w:t>✅</w:t>
-      </w:r>
-      <w:r>
-        <w:t xml:space="preserve"> **Solo Alta y Modificaci</w:t>
-      </w:r>
-      <w:r>
-        <w:rPr>
-          <w:rFonts w:ascii="Aptos" w:hAnsi="Aptos" w:cs="Aptos"/>
-        </w:rPr>
-        <w:t>ó</w:t>
-      </w:r>
-      <w:r>
-        <w:t xml:space="preserve">n** </w:t>
-      </w:r>
-      <w:r>
-        <w:rPr>
-          <w:rFonts w:ascii="Aptos" w:hAnsi="Aptos" w:cs="Aptos"/>
-        </w:rPr>
-        <w:t>→</w:t>
-      </w:r>
-      <w:r>
-        <w:t xml:space="preserve"> No hay DELETE f</w:t>
-      </w:r>
-      <w:r>
-        <w:rPr>
-          <w:rFonts w:ascii="Aptos" w:hAnsi="Aptos" w:cs="Aptos"/>
-        </w:rPr>
-        <w:t>í</w:t>
-      </w:r>
-      <w:r>
-        <w:t>sico</w:t>
-      </w:r>
-    </w:p>
-    <w:p>
-      <w:r>
-        <w:t xml:space="preserve">- </w:t>
-      </w:r>
-      <w:r>
-        <w:rPr>
-          <w:rFonts w:ascii="Segoe UI Emoji" w:hAnsi="Segoe UI Emoji" w:cs="Segoe UI Emoji"/>
-        </w:rPr>
-        <w:t>✅</w:t>
-      </w:r>
-      <w:r>
-        <w:t xml:space="preserve"> **Validaci</w:t>
-      </w:r>
-      <w:r>
-        <w:rPr>
-          <w:rFonts w:ascii="Aptos" w:hAnsi="Aptos" w:cs="Aptos"/>
-        </w:rPr>
-        <w:t>ó</w:t>
-      </w:r>
-      <w:r>
-        <w:t xml:space="preserve">n de permisos** </w:t>
-      </w:r>
-      <w:r>
-        <w:rPr>
-          <w:rFonts w:ascii="Aptos" w:hAnsi="Aptos" w:cs="Aptos"/>
-        </w:rPr>
-        <w:t>→</w:t>
-      </w:r>
-      <w:r>
-        <w:t xml:space="preserve"> El usuario debe tener autorizaci</w:t>
-      </w:r>
-      <w:r>
-        <w:rPr>
-          <w:rFonts w:ascii="Aptos" w:hAnsi="Aptos" w:cs="Aptos"/>
-        </w:rPr>
-        <w:t>ó</w:t>
-      </w:r>
-      <w:r>
-        <w:t xml:space="preserve">n </w:t>
-      </w:r>
-      <w:r>
-        <w:rPr>
-          <w:rFonts w:ascii="Aptos" w:hAnsi="Aptos" w:cs="Aptos"/>
-        </w:rPr>
-        <w:t>≥</w:t>
-      </w:r>
-      <w:r>
-        <w:t xml:space="preserve"> 2 para modificar</w:t>
-      </w:r>
-    </w:p>
-    <w:p>
-      <w:r>
-        <w:t xml:space="preserve">- </w:t>
-      </w:r>
-      <w:r>
-        <w:rPr>
-          <w:rFonts w:ascii="Segoe UI Emoji" w:hAnsi="Segoe UI Emoji" w:cs="Segoe UI Emoji"/>
-        </w:rPr>
-        <w:t>✅</w:t>
-      </w:r>
-      <w:r>
-        <w:t xml:space="preserve"> **IP y MAC** </w:t>
-      </w:r>
-      <w:r>
-        <w:rPr>
-          <w:rFonts w:ascii="Aptos" w:hAnsi="Aptos" w:cs="Aptos"/>
-        </w:rPr>
-        <w:t>→</w:t>
-      </w:r>
-      <w:r>
-        <w:t xml:space="preserve"> Se resuelven autom</w:t>
-      </w:r>
-      <w:r>
-        <w:rPr>
-          <w:rFonts w:ascii="Aptos" w:hAnsi="Aptos" w:cs="Aptos"/>
-        </w:rPr>
-        <w:t>á</w:t>
-      </w:r>
-      <w:r>
-        <w:t>ticamente desde la BD</w:t>
-      </w:r>
-    </w:p>
-    <w:p>
-      <w:r>
-        <w:t xml:space="preserve">- </w:t>
-      </w:r>
-      <w:r>
-        <w:rPr>
-          <w:rFonts w:ascii="Segoe UI Emoji" w:hAnsi="Segoe UI Emoji" w:cs="Segoe UI Emoji"/>
-        </w:rPr>
-        <w:t>✅</w:t>
-      </w:r>
-      <w:r>
-        <w:t xml:space="preserve"> **Encabezados del Grid** </w:t>
-      </w:r>
-      <w:r>
-        <w:rPr>
-          <w:rFonts w:ascii="Aptos" w:hAnsi="Aptos" w:cs="Aptos"/>
-        </w:rPr>
-        <w:t>→</w:t>
-      </w:r>
-      <w:r>
-        <w:t xml:space="preserve"> Nombres amigables y centrados (igual que en Usuarios)</w:t>
-      </w:r>
-    </w:p>
-    <w:p>
-      <w:r>
-        <w:t xml:space="preserve">- </w:t>
-      </w:r>
-      <w:r>
-        <w:rPr>
-          <w:rFonts w:ascii="Segoe UI Emoji" w:hAnsi="Segoe UI Emoji" w:cs="Segoe UI Emoji"/>
-        </w:rPr>
-        <w:t>✅</w:t>
-      </w:r>
-      <w:r>
-        <w:t xml:space="preserve"> **Exportaci</w:t>
-      </w:r>
-      <w:r>
-        <w:rPr>
-          <w:rFonts w:ascii="Aptos" w:hAnsi="Aptos" w:cs="Aptos"/>
-        </w:rPr>
-        <w:t>ó</w:t>
-      </w:r>
-      <w:r>
-        <w:t xml:space="preserve">n a Excel** </w:t>
-      </w:r>
-      <w:r>
-        <w:rPr>
-          <w:rFonts w:ascii="Aptos" w:hAnsi="Aptos" w:cs="Aptos"/>
-        </w:rPr>
-        <w:t>→</w:t>
-      </w:r>
-      <w:r>
-        <w:t xml:space="preserve"> Reutilizar el mismo servicio</w:t>
-      </w:r>
-    </w:p>
-    <w:p/>
-    <w:p>
-      <w:r>
-        <w:t>---</w:t>
-      </w:r>
-    </w:p>
-    <w:p/>
-    <w:p>
-      <w:r>
-        <w:t xml:space="preserve">## </w:t>
-      </w:r>
-      <w:r>
-        <w:rPr>
-          <w:rFonts w:ascii="Segoe UI Emoji" w:hAnsi="Segoe UI Emoji" w:cs="Segoe UI Emoji"/>
-        </w:rPr>
-        <w:t>✅</w:t>
-      </w:r>
-      <w:r>
-        <w:t xml:space="preserve"> Notas para ma</w:t>
-      </w:r>
-      <w:r>
-        <w:rPr>
-          <w:rFonts w:ascii="Aptos" w:hAnsi="Aptos" w:cs="Aptos"/>
-        </w:rPr>
-        <w:t>ñ</w:t>
-      </w:r>
-      <w:r>
-        <w:t>ana</w:t>
-      </w:r>
-    </w:p>
-    <w:p>
-      <w:r>
-        <w:lastRenderedPageBreak/>
-        <w:t>&gt; Mantener **la misma arquitectura y patrón** de `</w:t>
-      </w:r>
-      <w:proofErr w:type="spellStart"/>
-      <w:r>
-        <w:t>FrmManUser</w:t>
-      </w:r>
-      <w:proofErr w:type="spellEnd"/>
-      <w:r>
-        <w:t>`:</w:t>
-      </w:r>
-    </w:p>
-    <w:p>
-      <w:r>
-        <w:t>&gt; - Cargar Grid → renombrar encabezados en `</w:t>
-      </w:r>
-      <w:proofErr w:type="spellStart"/>
-      <w:r>
-        <w:t>DataBindingComplete</w:t>
-      </w:r>
-      <w:proofErr w:type="spellEnd"/>
-      <w:r>
-        <w:t>`</w:t>
-      </w:r>
-    </w:p>
-    <w:p>
-      <w:r>
-        <w:t>&gt; - Selección → llenar campos</w:t>
-      </w:r>
-    </w:p>
-    <w:p>
-      <w:r>
-        <w:t>&gt; - Botón Procesar → detectar Alta (id=0) o Modificación</w:t>
-      </w:r>
-    </w:p>
-    <w:p>
-      <w:r>
-        <w:t>&gt; - Llamada al SP correspondiente → mostrar mensaje de salida</w:t>
-      </w:r>
-    </w:p>
-    <w:p>
-      <w:r>
-        <w:t>&gt; - Refrescar y Excel</w:t>
-      </w:r>
-    </w:p>
-    <w:p/>
-    <w:p>
-      <w:r>
-        <w:t>---</w:t>
-      </w:r>
-    </w:p>
-    <w:p/>
-    <w:p>
-      <w:r>
-        <w:t xml:space="preserve">¡Listo! Quedo **en espera mañana** para empezar con el mantenimiento de Operaciones. Descansa y hasta entonces! </w:t>
-      </w:r>
-      <w:r>
-        <w:rPr>
-          <w:rFonts w:ascii="Segoe UI Emoji" w:hAnsi="Segoe UI Emoji" w:cs="Segoe UI Emoji"/>
-        </w:rPr>
-        <w:t>😊</w:t>
-      </w:r>
-    </w:p>
-    <w:p>
-      <w:r>
-        <w:t>Repositorio:</w:t>
-      </w:r>
-      <w:r>
-        <w:br/>
-      </w:r>
-      <w:r>
-        <w:br/>
-      </w:r>
-      <w:hyperlink r:id="rId5" w:history="1">
-        <w:r>
-          <w:rPr>
-            <w:rStyle w:val="Hipervnculo"/>
-          </w:rPr>
-          <w:t>https://github.com/pfzambranog/DesarrollosVisual.git</w:t>
-        </w:r>
-      </w:hyperlink>
-    </w:p>
-    <w:p/>
     <w:sectPr>
       <w:pgSz w:w="12240" w:h="15840"/>
       <w:pgMar w:top="1417" w:right="1701" w:bottom="1417" w:left="1701" w:header="708" w:footer="708" w:gutter="0"/>
@@ -1872,7 +1453,6 @@
   <w:style w:type="character" w:default="1" w:styleId="Fuentedeprrafopredeter">
     <w:name w:val="Default Paragraph Font"/>
     <w:uiPriority w:val="1"/>
-    <w:semiHidden/>
     <w:unhideWhenUsed/>
   </w:style>
   <w:style w:type="table" w:default="1" w:styleId="Tablanormal">

</xml_diff>